<commit_message>
Add Schengen NOC generation support and update document mappings
- Introduced a new endpoint for generating the Schengen maid NOC as a two-page AcroForm PDF, filled by field names and flattened for final output.
- Updated `document_mapping.json` to include mappings for the new Schengen NOC fields, ensuring accurate data representation.
- Modified the Invitation Letter template to reflect the use of multiple destinations for travel, enhancing clarity for visa applications.
- Enhanced error handling for missing templates and mappings in the NOC generation process.
</commit_message>
<xml_diff>
--- a/Documents Generation/Invitation Letter (Schengen Visa – Domestic Worker_Housemaid).docx
+++ b/Documents Generation/Invitation Letter (Schengen Visa – Domestic Worker_Housemaid).docx
@@ -224,7 +224,7 @@
           <w:b/>
           <w:bCs/>
         </w:rPr>
-        <w:t>schengen_country</w:t>
+        <w:t>destinations</w:t>
       </w:r>
       <w:proofErr w:type="spellEnd"/>
       <w:r>
@@ -308,7 +308,7 @@
           <w:b/>
           <w:bCs/>
         </w:rPr>
-        <w:t>schengen_country</w:t>
+        <w:t>destinations</w:t>
       </w:r>
       <w:proofErr w:type="spellEnd"/>
       <w:r>

</xml_diff>